<commit_message>
lite load of site
</commit_message>
<xml_diff>
--- a/docs/manuals/АИС Анкетирование. Инструкция администратора.docx
+++ b/docs/manuals/АИС Анкетирование. Инструкция администратора.docx
@@ -232,7 +232,16 @@
       </w:r>
     </w:p>
     <w:p>
-      <w:pPr/>
+      <w:pPr>
+        <w:tabs>
+          <w:tab w:val="right" w:leader="dot" w:pos="10008"/>
+        </w:tabs>
+        <w:spacing w:after="80" w:line="276" w:lineRule="auto"/>
+        <w:rPr>
+          <w:rFonts w:cs="Times New Roman"/>
+          <w:lang w:val="ru-RU"/>
+        </w:rPr>
+      </w:pPr>
       <w:r>
         <w:t>4. Шаблоны анкет</w:t>
         <w:tab/>

</xml_diff>